<commit_message>
lbi: final submission package — Definition 1 self-exclusion made explicit (j != i, g_j = c, matching the archived code); docx rebuilt with native Office Math (369 equations verified via Word), numbered tables/figures, resolved refs; r3 letter final-proofing note; date/punctuation fixes; make_docx.py pipeline committed
</commit_message>
<xml_diff>
--- a/docs/papers/foundations/submission/jscilaw/lbi_manuscript.docx
+++ b/docs/papers/foundations/submission/jscilaw/lbi_manuscript.docx
@@ -7,31 +7,7 @@
         <w:pStyle w:val="Title"/>
       </w:pPr>
       <w:r>
-        <w:rPr>
-          <w:b/>
-          <w:bCs/>
-        </w:rPr>
-        <w:t xml:space="preserve">The Legal Bond Index:</w:t>
-      </w:r>
-      <w:r>
-        <w:br/>
-      </w:r>
-      <w:r>
-        <w:rPr>
-          <w:b/>
-          <w:bCs/>
-        </w:rPr>
-        <w:t xml:space="preserve">A Matched-Neighbourhood Diagnostic of Algorithmic</w:t>
-      </w:r>
-      <w:r>
-        <w:br/>
-      </w:r>
-      <w:r>
-        <w:rPr>
-          <w:b/>
-          <w:bCs/>
-        </w:rPr>
-        <w:t xml:space="preserve">Disparity, Applied to COMPAS</w:t>
+        <w:t xml:space="preserve">The Legal Bond Index: A Matched-Neighbourhood Diagnostic of Algorithmic Disparity, Applied to COMPAS</w:t>
       </w:r>
     </w:p>
     <w:p>
@@ -63,6 +39,9 @@
         <w:t xml:space="preserve">andrew.bond@sjsu.edu</w:t>
       </w:r>
       <w:r>
+        <w:br/>
+      </w:r>
+      <w:r>
         <w:t xml:space="preserve">ORCID: 0009-0003-2599-6158</w:t>
       </w:r>
     </w:p>
@@ -71,7 +50,7 @@
         <w:pStyle w:val="Date"/>
       </w:pPr>
       <w:r>
-        <w:t xml:space="preserve">July 2026 (revised)</w:t>
+        <w:t xml:space="preserve">August 2026 (revised)</w:t>
       </w:r>
     </w:p>
     <w:p>
@@ -142,10 +121,7 @@
         <w:t xml:space="preserve"> </w:t>
       </w:r>
       <w:r>
-        <w:t xml:space="preserve"> </w:t>
-      </w:r>
-      <w:r>
-        <w:t xml:space="preserve">proved that the two properties</w:t>
+        <w:t xml:space="preserve">(Chouldechova, 2017; Kleinberg et al., 2017) proved that the two properties</w:t>
       </w:r>
       <w:r>
         <w:t xml:space="preserve"> </w:t>
@@ -1045,10 +1021,7 @@
         <w:t xml:space="preserve"> </w:t>
       </w:r>
       <w:r>
-        <w:t xml:space="preserve"> </w:t>
-      </w:r>
-      <w:r>
-        <w:t xml:space="preserve">arguing that the COMPAS recidivism-risk algorithm,</w:t>
+        <w:t xml:space="preserve">(Angwin et al., 2016) arguing that the COMPAS recidivism-risk algorithm,</w:t>
       </w:r>
       <w:r>
         <w:t xml:space="preserve"> </w:t>
@@ -1118,13 +1091,7 @@
         <w:t xml:space="preserve"> </w:t>
       </w:r>
       <w:r>
-        <w:t xml:space="preserve">approximately the same across races</w:t>
-      </w:r>
-      <w:r>
-        <w:t xml:space="preserve"> </w:t>
-      </w:r>
-      <w:r>
-        <w:t xml:space="preserve">. Both parties could substantiate their claims</w:t>
+        <w:t xml:space="preserve">approximately the same across races (Dieterich et al., 2016). Both parties could substantiate their claims</w:t>
       </w:r>
       <w:r>
         <w:t xml:space="preserve"> </w:t>
@@ -1150,16 +1117,13 @@
         <w:t xml:space="preserve"> </w:t>
       </w:r>
       <w:r>
-        <w:t xml:space="preserve"> </w:t>
-      </w:r>
-      <w:r>
-        <w:t xml:space="preserve">and</w:t>
-      </w:r>
-      <w:r>
-        <w:t xml:space="preserve"> </w:t>
-      </w:r>
-      <w:r>
-        <w:t xml:space="preserve">, working independently,</w:t>
+        <w:t xml:space="preserve">Chouldechova (2017) and</w:t>
+      </w:r>
+      <w:r>
+        <w:t xml:space="preserve"> </w:t>
+      </w:r>
+      <w:r>
+        <w:t xml:space="preserve">Kleinberg et al. (2017), working independently,</w:t>
       </w:r>
       <w:r>
         <w:t xml:space="preserve"> </w:t>
@@ -1308,22 +1272,13 @@
         <w:t xml:space="preserve"> </w:t>
       </w:r>
       <w:r>
-        <w:t xml:space="preserve">equal across groups</w:t>
-      </w:r>
-      <w:r>
-        <w:t xml:space="preserve"> </w:t>
-      </w:r>
-      <w:r>
-        <w:t xml:space="preserve">. Equalized odds</w:t>
-      </w:r>
-      <w:r>
-        <w:t xml:space="preserve"> </w:t>
-      </w:r>
-      <w:r>
-        <w:t xml:space="preserve"> </w:t>
-      </w:r>
-      <w:r>
-        <w:t xml:space="preserve">requires equal true-positive and false-positive</w:t>
+        <w:t xml:space="preserve">equal across groups (Feldman et al., 2015). Equalized odds</w:t>
+      </w:r>
+      <w:r>
+        <w:t xml:space="preserve"> </w:t>
+      </w:r>
+      <w:r>
+        <w:t xml:space="preserve">(Hardt et al., 2016) requires equal true-positive and false-positive</w:t>
       </w:r>
       <w:r>
         <w:t xml:space="preserve"> </w:t>
@@ -1341,16 +1296,7 @@
         <w:t xml:space="preserve"> </w:t>
       </w:r>
       <w:r>
-        <w:t xml:space="preserve">groups. Counterfactual fairness</w:t>
-      </w:r>
-      <w:r>
-        <w:t xml:space="preserve"> </w:t>
-      </w:r>
-      <w:r>
-        <w:t xml:space="preserve"> </w:t>
-      </w:r>
-      <w:r>
-        <w:t xml:space="preserve">requires that an</w:t>
+        <w:t xml:space="preserve">groups. Counterfactual fairness (Kusner et al., 2017) requires that an</w:t>
       </w:r>
       <w:r>
         <w:t xml:space="preserve"> </w:t>
@@ -1368,10 +1314,7 @@
         <w:t xml:space="preserve"> </w:t>
       </w:r>
       <w:r>
-        <w:t xml:space="preserve"> </w:t>
-      </w:r>
-      <w:r>
-        <w:t xml:space="preserve">requires that similar individuals receive similar</w:t>
+        <w:t xml:space="preserve">(Dwork et al., 2012) requires that similar individuals receive similar</w:t>
       </w:r>
       <w:r>
         <w:t xml:space="preserve"> </w:t>
@@ -1895,18 +1838,7 @@
         <w:t xml:space="preserve"> </w:t>
       </w:r>
       <w:r>
-        <w:t xml:space="preserve">(§</w:t>
-      </w:r>
-      <w:hyperlink w:anchor="sec:distdiag">
-        <w:r>
-          <w:rPr>
-            <w:rStyle w:val="Hyperlink"/>
-          </w:rPr>
-          <w:t xml:space="preserve">4.5</w:t>
-        </w:r>
-      </w:hyperlink>
-      <w:r>
-        <w:t xml:space="preserve">), and build the mechanical</w:t>
+        <w:t xml:space="preserve">(§4.5), and build the mechanical</w:t>
       </w:r>
       <w:r>
         <w:t xml:space="preserve"> </w:t>
@@ -1961,18 +1893,7 @@
         </m:r>
       </m:oMath>
       <w:r>
-        <w:t xml:space="preserve">; §</w:t>
-      </w:r>
-      <w:hyperlink w:anchor="sec:inferenceresults">
-        <w:r>
-          <w:rPr>
-            <w:rStyle w:val="Hyperlink"/>
-          </w:rPr>
-          <w:t xml:space="preserve">4.6</w:t>
-        </w:r>
-      </w:hyperlink>
-      <w:r>
-        <w:t xml:space="preserve">). The entire</w:t>
+        <w:t xml:space="preserve">; §4.6). The entire</w:t>
       </w:r>
       <w:r>
         <w:t xml:space="preserve"> </w:t>
@@ -1984,18 +1905,7 @@
         <w:t xml:space="preserve"> </w:t>
       </w:r>
       <w:r>
-        <w:t xml:space="preserve">with known ground truth (§</w:t>
-      </w:r>
-      <w:hyperlink w:anchor="sec:synthetic">
-        <w:r>
-          <w:rPr>
-            <w:rStyle w:val="Hyperlink"/>
-          </w:rPr>
-          <w:t xml:space="preserve">4.9</w:t>
-        </w:r>
-      </w:hyperlink>
-      <w:r>
-        <w:t xml:space="preserve">).</w:t>
+        <w:t xml:space="preserve">with known ground truth (§4.9).</w:t>
       </w:r>
     </w:p>
     <w:p>
@@ -2003,47 +1913,13 @@
         <w:pStyle w:val="BodyText"/>
       </w:pPr>
       <w:r>
-        <w:t xml:space="preserve">The remainder of this paper proceeds as follows. Section</w:t>
-      </w:r>
-      <w:r>
-        <w:t xml:space="preserve"> </w:t>
-      </w:r>
-      <w:hyperlink w:anchor="sec:background">
-        <w:r>
-          <w:rPr>
-            <w:rStyle w:val="Hyperlink"/>
-          </w:rPr>
-          <w:t xml:space="preserve">2</w:t>
-        </w:r>
-      </w:hyperlink>
-      <w:r>
-        <w:t xml:space="preserve"> </w:t>
-      </w:r>
-      <w:r>
-        <w:t xml:space="preserve">reviews the COMPAS controversy and the existing</w:t>
-      </w:r>
-      <w:r>
-        <w:t xml:space="preserve"> </w:t>
-      </w:r>
-      <w:r>
-        <w:t xml:space="preserve">fairness-metric landscape. Section</w:t>
-      </w:r>
-      <w:r>
-        <w:t xml:space="preserve"> </w:t>
-      </w:r>
-      <w:hyperlink w:anchor="sec:lbi">
-        <w:r>
-          <w:rPr>
-            <w:rStyle w:val="Hyperlink"/>
-          </w:rPr>
-          <w:t xml:space="preserve">3</w:t>
-        </w:r>
-      </w:hyperlink>
-      <w:r>
-        <w:t xml:space="preserve"> </w:t>
-      </w:r>
-      <w:r>
-        <w:t xml:space="preserve">defines LBI formally,</w:t>
+        <w:t xml:space="preserve">The remainder of this paper proceeds as follows. Section 2 reviews the COMPAS controversy and the existing</w:t>
+      </w:r>
+      <w:r>
+        <w:t xml:space="preserve"> </w:t>
+      </w:r>
+      <w:r>
+        <w:t xml:space="preserve">fairness-metric landscape. Section 3 defines LBI formally,</w:t>
       </w:r>
       <w:r>
         <w:t xml:space="preserve"> </w:t>
@@ -2055,24 +1931,7 @@
         <w:t xml:space="preserve"> </w:t>
       </w:r>
       <w:r>
-        <w:t xml:space="preserve">out the inference machinery. Section</w:t>
-      </w:r>
-      <w:r>
-        <w:t xml:space="preserve"> </w:t>
-      </w:r>
-      <w:hyperlink w:anchor="sec:empirical">
-        <w:r>
-          <w:rPr>
-            <w:rStyle w:val="Hyperlink"/>
-          </w:rPr>
-          <w:t xml:space="preserve">4</w:t>
-        </w:r>
-      </w:hyperlink>
-      <w:r>
-        <w:t xml:space="preserve"> </w:t>
-      </w:r>
-      <w:r>
-        <w:t xml:space="preserve">reports the</w:t>
+        <w:t xml:space="preserve">out the inference machinery. Section 4 reports the</w:t>
       </w:r>
       <w:r>
         <w:t xml:space="preserve"> </w:t>
@@ -2084,42 +1943,14 @@
         <w:t xml:space="preserve"> </w:t>
       </w:r>
       <w:r>
-        <w:t xml:space="preserve">robustness, and the synthetic validation. Section</w:t>
-      </w:r>
-      <w:r>
-        <w:t xml:space="preserve"> </w:t>
-      </w:r>
-      <w:hyperlink w:anchor="sec:discussion">
-        <w:r>
-          <w:rPr>
-            <w:rStyle w:val="Hyperlink"/>
-          </w:rPr>
-          <w:t xml:space="preserve">5</w:t>
-        </w:r>
-      </w:hyperlink>
-      <w:r>
-        <w:t xml:space="preserve"> </w:t>
-      </w:r>
-      <w:r>
-        <w:t xml:space="preserve">compares LBI to the existing criteria, identifies</w:t>
-      </w:r>
-      <w:r>
-        <w:t xml:space="preserve"> </w:t>
-      </w:r>
-      <w:r>
-        <w:t xml:space="preserve">what it adds, and discusses limitations. Section</w:t>
-      </w:r>
-      <w:r>
-        <w:t xml:space="preserve"> </w:t>
-      </w:r>
-      <w:hyperlink w:anchor="sec:policy">
-        <w:r>
-          <w:rPr>
-            <w:rStyle w:val="Hyperlink"/>
-          </w:rPr>
-          <w:t xml:space="preserve">6</w:t>
-        </w:r>
-      </w:hyperlink>
+        <w:t xml:space="preserve">robustness, and the synthetic validation. Section 5 compares LBI to the existing criteria, identifies</w:t>
+      </w:r>
+      <w:r>
+        <w:t xml:space="preserve"> </w:t>
+      </w:r>
+      <w:r>
+        <w:t xml:space="preserve">what it adds, and discusses limitations. Section 6</w:t>
+      </w:r>
       <w:r>
         <w:t xml:space="preserve"> </w:t>
       </w:r>
@@ -2130,24 +1961,7 @@
         <w:t xml:space="preserve"> </w:t>
       </w:r>
       <w:r>
-        <w:t xml:space="preserve">context. Section</w:t>
-      </w:r>
-      <w:r>
-        <w:t xml:space="preserve"> </w:t>
-      </w:r>
-      <w:hyperlink w:anchor="sec:conclusion">
-        <w:r>
-          <w:rPr>
-            <w:rStyle w:val="Hyperlink"/>
-          </w:rPr>
-          <w:t xml:space="preserve">7</w:t>
-        </w:r>
-      </w:hyperlink>
-      <w:r>
-        <w:t xml:space="preserve"> </w:t>
-      </w:r>
-      <w:r>
-        <w:t xml:space="preserve">concludes.</w:t>
+        <w:t xml:space="preserve">context. Section 7 concludes.</w:t>
       </w:r>
     </w:p>
     <w:bookmarkEnd w:id="9"/>
@@ -2198,13 +2012,7 @@
         <w:t xml:space="preserve"> </w:t>
       </w:r>
       <w:r>
-        <w:t xml:space="preserve">analysis</w:t>
-      </w:r>
-      <w:r>
-        <w:t xml:space="preserve"> </w:t>
-      </w:r>
-      <w:r>
-        <w:t xml:space="preserve">, working from public records in Broward</w:t>
+        <w:t xml:space="preserve">analysis (Angwin et al., 2016), working from public records in Broward</w:t>
       </w:r>
       <w:r>
         <w:t xml:space="preserve"> </w:t>
@@ -2273,16 +2081,7 @@
         <w:pStyle w:val="BodyText"/>
       </w:pPr>
       <w:r>
-        <w:t xml:space="preserve">Northpointe’s response</w:t>
-      </w:r>
-      <w:r>
-        <w:t xml:space="preserve"> </w:t>
-      </w:r>
-      <w:r>
-        <w:t xml:space="preserve"> </w:t>
-      </w:r>
-      <w:r>
-        <w:t xml:space="preserve">disputed several of</w:t>
+        <w:t xml:space="preserve">Northpointe’s response (Dieterich et al., 2016) disputed several of</w:t>
       </w:r>
       <w:r>
         <w:t xml:space="preserve"> </w:t>
@@ -2369,10 +2168,7 @@
         <w:t xml:space="preserve"> </w:t>
       </w:r>
       <w:r>
-        <w:t xml:space="preserve"> </w:t>
-      </w:r>
-      <w:r>
-        <w:t xml:space="preserve">proved that an instrument satisfying</w:t>
+        <w:t xml:space="preserve">Chouldechova (2017) proved that an instrument satisfying</w:t>
       </w:r>
       <w:r>
         <w:t xml:space="preserve"> </w:t>
@@ -2406,10 +2202,7 @@
         <w:t xml:space="preserve"> </w:t>
       </w:r>
       <w:r>
-        <w:t xml:space="preserve"> </w:t>
-      </w:r>
-      <w:r>
-        <w:t xml:space="preserve">proved an analogous impossibility theorem for</w:t>
+        <w:t xml:space="preserve">Kleinberg et al. (2017) proved an analogous impossibility theorem for</w:t>
       </w:r>
       <w:r>
         <w:t xml:space="preserve"> </w:t>
@@ -2475,10 +2268,7 @@
         <w:t xml:space="preserve"> </w:t>
       </w:r>
       <w:r>
-        <w:t xml:space="preserve">(</w:t>
-      </w:r>
-      <w:r>
-        <w:t xml:space="preserve">).</w:t>
+        <w:t xml:space="preserve">(Feldman et al., 2015).</w:t>
       </w:r>
       <w:r>
         <w:t xml:space="preserve"> </w:t>
@@ -2727,7 +2517,7 @@
         <w:t xml:space="preserve"> </w:t>
       </w:r>
       <w:r>
-        <w:t xml:space="preserve">. The EEOC’s</w:t>
+        <w:t xml:space="preserve">(Barocas and Selbst, 2016). The EEOC’s</w:t>
       </w:r>
       <w:r>
         <w:t xml:space="preserve"> </w:t>
@@ -2775,10 +2565,7 @@
         <w:t xml:space="preserve"> </w:t>
       </w:r>
       <w:r>
-        <w:t xml:space="preserve">(</w:t>
-      </w:r>
-      <w:r>
-        <w:t xml:space="preserve">).</w:t>
+        <w:t xml:space="preserve">(Hardt et al., 2016).</w:t>
       </w:r>
       <w:r>
         <w:t xml:space="preserve"> </w:t>
@@ -2999,10 +2786,7 @@
         <w:t xml:space="preserve"> </w:t>
       </w:r>
       <w:r>
-        <w:t xml:space="preserve">(</w:t>
-      </w:r>
-      <w:r>
-        <w:t xml:space="preserve">).</w:t>
+        <w:t xml:space="preserve">(Chouldechova, 2017).</w:t>
       </w:r>
       <w:r>
         <w:t xml:space="preserve"> </w:t>
@@ -3460,10 +3244,7 @@
         <w:t xml:space="preserve"> </w:t>
       </w:r>
       <w:r>
-        <w:t xml:space="preserve">(</w:t>
-      </w:r>
-      <w:r>
-        <w:t xml:space="preserve">). The</w:t>
+        <w:t xml:space="preserve">(Kusner et al., 2017). The</w:t>
       </w:r>
       <w:r>
         <w:t xml:space="preserve"> </w:t>
@@ -3655,10 +3436,7 @@
         <w:t xml:space="preserve"> </w:t>
       </w:r>
       <w:r>
-        <w:t xml:space="preserve">(</w:t>
-      </w:r>
-      <w:r>
-        <w:t xml:space="preserve">). Similar</w:t>
+        <w:t xml:space="preserve">(Dwork et al., 2012). Similar</w:t>
       </w:r>
       <w:r>
         <w:t xml:space="preserve"> </w:t>
@@ -3768,18 +3546,7 @@
         <w:t xml:space="preserve"> </w:t>
       </w:r>
       <w:r>
-        <w:t xml:space="preserve">certification of its property (§</w:t>
-      </w:r>
-      <w:hyperlink w:anchor="sec:individualfairness">
-        <w:r>
-          <w:rPr>
-            <w:rStyle w:val="Hyperlink"/>
-          </w:rPr>
-          <w:t xml:space="preserve">5.2</w:t>
-        </w:r>
-      </w:hyperlink>
-      <w:r>
-        <w:t xml:space="preserve">).</w:t>
+        <w:t xml:space="preserve">certification of its property (§5.2).</w:t>
       </w:r>
     </w:p>
     <w:bookmarkEnd w:id="11"/>
@@ -3943,29 +3710,7 @@
         <w:t xml:space="preserve"> </w:t>
       </w:r>
       <w:r>
-        <w:t xml:space="preserve">(§</w:t>
-      </w:r>
-      <w:hyperlink w:anchor="sec:discussion">
-        <w:r>
-          <w:rPr>
-            <w:rStyle w:val="Hyperlink"/>
-          </w:rPr>
-          <w:t xml:space="preserve">5</w:t>
-        </w:r>
-      </w:hyperlink>
-      <w:r>
-        <w:t xml:space="preserve">, §</w:t>
-      </w:r>
-      <w:hyperlink w:anchor="sec:robustness">
-        <w:r>
-          <w:rPr>
-            <w:rStyle w:val="Hyperlink"/>
-          </w:rPr>
-          <w:t xml:space="preserve">4.8</w:t>
-        </w:r>
-      </w:hyperlink>
-      <w:r>
-        <w:t xml:space="preserve">).</w:t>
+        <w:t xml:space="preserve">(§5, §4.8).</w:t>
       </w:r>
     </w:p>
     <w:p>
@@ -4270,18 +4015,7 @@
         <w:t xml:space="preserve"> </w:t>
       </w:r>
       <w:r>
-        <w:t xml:space="preserve">Section </w:t>
-      </w:r>
-      <w:hyperlink w:anchor="sec:discussion">
-        <w:r>
-          <w:rPr>
-            <w:rStyle w:val="Hyperlink"/>
-          </w:rPr>
-          <w:t xml:space="preserve">5</w:t>
-        </w:r>
-      </w:hyperlink>
-      <w:r>
-        <w:t xml:space="preserve">). The algorithm assigns a score</w:t>
+        <w:t xml:space="preserve">Section 5). The algorithm assigns a score</w:t>
       </w:r>
       <w:r>
         <w:t xml:space="preserve"> </w:t>
@@ -4675,7 +4409,7 @@
         <w:t xml:space="preserve"> </w:t>
       </w:r>
       <w:r>
-        <w:t xml:space="preserve">.</w:t>
+        <w:t xml:space="preserve">(Mahalanobis, 1936).</w:t>
       </w:r>
     </w:p>
     <w:bookmarkStart w:id="14" w:name="def:lbi"/>
@@ -4803,13 +4537,11 @@
         </w:rPr>
         <w:t xml:space="preserve">is</w:t>
       </w:r>
-      <w:r>
-        <w:rPr>
-          <w:i/>
-          <w:iCs/>
-        </w:rPr>
-        <w:t xml:space="preserve"> </w:t>
-      </w:r>
+    </w:p>
+    <w:p>
+      <w:pPr>
+        <w:pStyle w:val="BodyText"/>
+      </w:pPr>
       <m:oMathPara>
         <m:oMathParaPr>
           <m:jc m:val="center"/>
@@ -5219,13 +4951,11 @@
           </m:r>
         </m:oMath>
       </m:oMathPara>
-      <w:r>
-        <w:rPr>
-          <w:i/>
-          <w:iCs/>
-        </w:rPr>
-        <w:t xml:space="preserve"> </w:t>
-      </w:r>
+    </w:p>
+    <w:p>
+      <w:pPr>
+        <w:pStyle w:val="FirstParagraph"/>
+      </w:pPr>
       <w:r>
         <w:rPr>
           <w:i/>
@@ -5316,7 +5046,7 @@
           <w:i/>
           <w:iCs/>
         </w:rPr>
-        <w:t xml:space="preserve">nearest neighbours to</w:t>
+        <w:t xml:space="preserve">nearest neighbours</w:t>
       </w:r>
       <w:r>
         <w:rPr>
@@ -5325,12 +5055,33 @@
         </w:rPr>
         <w:t xml:space="preserve"> </w:t>
       </w:r>
+      <m:oMath>
+        <m:r>
+          <m:t>j</m:t>
+        </m:r>
+        <m:r>
+          <m:rPr>
+            <m:sty m:val="p"/>
+          </m:rPr>
+          <m:t>≠</m:t>
+        </m:r>
+        <m:r>
+          <m:t>i</m:t>
+        </m:r>
+      </m:oMath>
       <w:r>
         <w:rPr>
           <w:i/>
           <w:iCs/>
         </w:rPr>
-        <w:t xml:space="preserve">individual</w:t>
+        <w:t xml:space="preserve"> </w:t>
+      </w:r>
+      <w:r>
+        <w:rPr>
+          <w:i/>
+          <w:iCs/>
+        </w:rPr>
+        <w:t xml:space="preserve">to individual</w:t>
       </w:r>
       <w:r>
         <w:rPr>
@@ -5412,7 +5163,7 @@
           <w:i/>
           <w:iCs/>
         </w:rPr>
-        <w:t xml:space="preserve">satisfying condition</w:t>
+        <w:t xml:space="preserve">with</w:t>
       </w:r>
       <w:r>
         <w:rPr>
@@ -5422,6 +5173,24 @@
         <w:t xml:space="preserve"> </w:t>
       </w:r>
       <m:oMath>
+        <m:sSub>
+          <m:e>
+            <m:r>
+              <m:t>g</m:t>
+            </m:r>
+          </m:e>
+          <m:sub>
+            <m:r>
+              <m:t>j</m:t>
+            </m:r>
+          </m:sub>
+        </m:sSub>
+        <m:r>
+          <m:rPr>
+            <m:sty m:val="p"/>
+          </m:rPr>
+          <m:t>=</m:t>
+        </m:r>
         <m:r>
           <m:t>c</m:t>
         </m:r>
@@ -5431,7 +5200,75 @@
           <w:i/>
           <w:iCs/>
         </w:rPr>
-        <w:t xml:space="preserve">, and</w:t>
+        <w:t xml:space="preserve"> </w:t>
+      </w:r>
+      <w:r>
+        <w:rPr>
+          <w:i/>
+          <w:iCs/>
+        </w:rPr>
+        <w:t xml:space="preserve">(writing</w:t>
+      </w:r>
+      <w:r>
+        <w:rPr>
+          <w:i/>
+          <w:iCs/>
+        </w:rPr>
+        <w:t xml:space="preserve"> </w:t>
+      </w:r>
+      <m:oMath>
+        <m:r>
+          <m:rPr>
+            <m:sty m:val="p"/>
+          </m:rPr>
+          <m:t>¬</m:t>
+        </m:r>
+        <m:sSub>
+          <m:e>
+            <m:r>
+              <m:t>g</m:t>
+            </m:r>
+          </m:e>
+          <m:sub>
+            <m:r>
+              <m:t>i</m:t>
+            </m:r>
+          </m:sub>
+        </m:sSub>
+        <m:r>
+          <m:rPr>
+            <m:sty m:val="p"/>
+          </m:rPr>
+          <m:t>=</m:t>
+        </m:r>
+        <m:r>
+          <m:t>1</m:t>
+        </m:r>
+        <m:r>
+          <m:rPr>
+            <m:sty m:val="p"/>
+          </m:rPr>
+          <m:t>−</m:t>
+        </m:r>
+        <m:sSub>
+          <m:e>
+            <m:r>
+              <m:t>g</m:t>
+            </m:r>
+          </m:e>
+          <m:sub>
+            <m:r>
+              <m:t>i</m:t>
+            </m:r>
+          </m:sub>
+        </m:sSub>
+      </m:oMath>
+      <w:r>
+        <w:rPr>
+          <w:i/>
+          <w:iCs/>
+        </w:rPr>
+        <w:t xml:space="preserve">), and</w:t>
       </w:r>
       <w:r>
         <w:rPr>
@@ -5470,13 +5307,27 @@
           <w:i/>
           <w:iCs/>
         </w:rPr>
-        <w:t xml:space="preserve">is the empirical mean over individuals.</w:t>
+        <w:t xml:space="preserve">is the empirical mean over</w:t>
+      </w:r>
+      <w:r>
+        <w:rPr>
+          <w:i/>
+          <w:iCs/>
+        </w:rPr>
+        <w:t xml:space="preserve"> </w:t>
+      </w:r>
+      <w:r>
+        <w:rPr>
+          <w:i/>
+          <w:iCs/>
+        </w:rPr>
+        <w:t xml:space="preserve">individuals.</w:t>
       </w:r>
     </w:p>
     <w:bookmarkEnd w:id="14"/>
     <w:p>
       <w:pPr>
-        <w:pStyle w:val="FirstParagraph"/>
+        <w:pStyle w:val="BodyText"/>
       </w:pPr>
       <w:r>
         <w:t xml:space="preserve">The parameter</w:t>
@@ -5961,35 +5812,13 @@
         <w:t xml:space="preserve"> </w:t>
       </w:r>
       <w:r>
-        <w:t xml:space="preserve">features do not capture (§</w:t>
-      </w:r>
-      <w:hyperlink w:anchor="sec:distdiag">
-        <w:r>
-          <w:rPr>
-            <w:rStyle w:val="Hyperlink"/>
-          </w:rPr>
-          <w:t xml:space="preserve">4.5</w:t>
-        </w:r>
-      </w:hyperlink>
-      <w:r>
-        <w:t xml:space="preserve">,</w:t>
-      </w:r>
-      <w:r>
-        <w:t xml:space="preserve"> </w:t>
-      </w:r>
-      <w:r>
-        <w:t xml:space="preserve">§</w:t>
-      </w:r>
-      <w:hyperlink w:anchor="sec:synthetic">
-        <w:r>
-          <w:rPr>
-            <w:rStyle w:val="Hyperlink"/>
-          </w:rPr>
-          <w:t xml:space="preserve">4.9</w:t>
-        </w:r>
-      </w:hyperlink>
-      <w:r>
-        <w:t xml:space="preserve">).</w:t>
+        <w:t xml:space="preserve">features do not capture (§4.5,</w:t>
+      </w:r>
+      <w:r>
+        <w:t xml:space="preserve"> </w:t>
+      </w:r>
+      <w:r>
+        <w:t xml:space="preserve">§4.9).</w:t>
       </w:r>
     </w:p>
     <w:p>
@@ -6085,21 +5914,7 @@
         <w:pStyle w:val="FirstParagraph"/>
       </w:pPr>
       <w:r>
-        <w:t xml:space="preserve">Each of the three choices in Definition </w:t>
-      </w:r>
-      <w:hyperlink w:anchor="def:lbi">
-        <w:r>
-          <w:rPr>
-            <w:rStyle w:val="Hyperlink"/>
-          </w:rPr>
-          <w:t xml:space="preserve">1</w:t>
-        </w:r>
-      </w:hyperlink>
-      <w:r>
-        <w:t xml:space="preserve"> </w:t>
-      </w:r>
-      <w:r>
-        <w:t xml:space="preserve">is deliberate.</w:t>
+        <w:t xml:space="preserve">Each of the three choices in Definition 1 is deliberate.</w:t>
       </w:r>
     </w:p>
     <w:p>
@@ -6122,19 +5937,8 @@
       <w:r>
         <w:t xml:space="preserve"> </w:t>
       </w:r>
-      <w:hyperlink w:anchor="eq:lbi">
-        <w:r>
-          <w:rPr>
-            <w:rStyle w:val="Hyperlink"/>
-          </w:rPr>
-          <w:t xml:space="preserve">[eq:lbi]</w:t>
-        </w:r>
-      </w:hyperlink>
-      <w:r>
-        <w:t xml:space="preserve"> </w:t>
-      </w:r>
-      <w:r>
-        <w:t xml:space="preserve">provides a within-group baseline against which the</w:t>
+      <w:r>
+        <w:t xml:space="preserve">the LBI ratio (Definition 1) provides a within-group baseline against which the</w:t>
       </w:r>
       <w:r>
         <w:t xml:space="preserve"> </w:t>
@@ -6238,35 +6042,13 @@
         <w:t xml:space="preserve"> </w:t>
       </w:r>
       <w:r>
-        <w:t xml:space="preserve">account of relevant similarity (§</w:t>
-      </w:r>
-      <w:hyperlink w:anchor="sec:discussion">
-        <w:r>
-          <w:rPr>
-            <w:rStyle w:val="Hyperlink"/>
-          </w:rPr>
-          <w:t xml:space="preserve">5</w:t>
-        </w:r>
-      </w:hyperlink>
-      <w:r>
-        <w:t xml:space="preserve">,</w:t>
-      </w:r>
-      <w:r>
-        <w:t xml:space="preserve"> </w:t>
-      </w:r>
-      <w:r>
-        <w:t xml:space="preserve">§</w:t>
-      </w:r>
-      <w:hyperlink w:anchor="sec:robustness">
-        <w:r>
-          <w:rPr>
-            <w:rStyle w:val="Hyperlink"/>
-          </w:rPr>
-          <w:t xml:space="preserve">4.8</w:t>
-        </w:r>
-      </w:hyperlink>
-      <w:r>
-        <w:t xml:space="preserve">).</w:t>
+        <w:t xml:space="preserve">account of relevant similarity (§5,</w:t>
+      </w:r>
+      <w:r>
+        <w:t xml:space="preserve"> </w:t>
+      </w:r>
+      <w:r>
+        <w:t xml:space="preserve">§4.8).</w:t>
       </w:r>
     </w:p>
     <w:p>
@@ -6611,13 +6393,7 @@
         <w:t xml:space="preserve"> </w:t>
       </w:r>
       <w:r>
-        <w:t xml:space="preserve">de-correlates by construction</w:t>
-      </w:r>
-      <w:r>
-        <w:t xml:space="preserve"> </w:t>
-      </w:r>
-      <w:r>
-        <w:t xml:space="preserve">. Equivalently,</w:t>
+        <w:t xml:space="preserve">de-correlates by construction (Mahalanobis, 1936). Equivalently,</w:t>
       </w:r>
       <w:r>
         <w:t xml:space="preserve"> </w:t>
@@ -6675,21 +6451,7 @@
         <w:t xml:space="preserve"> </w:t>
       </w:r>
       <w:r>
-        <w:t xml:space="preserve">de-correlated direction. Section </w:t>
-      </w:r>
-      <w:hyperlink w:anchor="sec:robustness">
-        <w:r>
-          <w:rPr>
-            <w:rStyle w:val="Hyperlink"/>
-          </w:rPr>
-          <w:t xml:space="preserve">4.8</w:t>
-        </w:r>
-      </w:hyperlink>
-      <w:r>
-        <w:t xml:space="preserve"> </w:t>
-      </w:r>
-      <w:r>
-        <w:t xml:space="preserve">shows the</w:t>
+        <w:t xml:space="preserve">de-correlated direction. Section 4.8 shows the</w:t>
       </w:r>
       <w:r>
         <w:t xml:space="preserve"> </w:t>
@@ -7480,16 +7242,8 @@
         <w:t xml:space="preserve"> </w:t>
       </w:r>
       <w:r>
-        <w:t xml:space="preserve">treat it as a first-class part of the method: §</w:t>
-      </w:r>
-      <w:hyperlink w:anchor="sec:distdiag">
-        <w:r>
-          <w:rPr>
-            <w:rStyle w:val="Hyperlink"/>
-          </w:rPr>
-          <w:t xml:space="preserve">4.5</w:t>
-        </w:r>
-      </w:hyperlink>
+        <w:t xml:space="preserve">treat it as a first-class part of the method: §4.5</w:t>
+      </w:r>
       <w:r>
         <w:t xml:space="preserve"> </w:t>
       </w:r>
@@ -7506,21 +7260,7 @@
         <w:t xml:space="preserve"> </w:t>
       </w:r>
       <w:r>
-        <w:t xml:space="preserve">specifications, and §</w:t>
-      </w:r>
-      <w:hyperlink w:anchor="sec:synthetic">
-        <w:r>
-          <w:rPr>
-            <w:rStyle w:val="Hyperlink"/>
-          </w:rPr>
-          <w:t xml:space="preserve">4.9</w:t>
-        </w:r>
-      </w:hyperlink>
-      <w:r>
-        <w:t xml:space="preserve"> </w:t>
-      </w:r>
-      <w:r>
-        <w:t xml:space="preserve">calibrates the entire</w:t>
+        <w:t xml:space="preserve">specifications, and §4.9 calibrates the entire</w:t>
       </w:r>
       <w:r>
         <w:t xml:space="preserve"> </w:t>
@@ -7598,7 +7338,7 @@
         <w:t xml:space="preserve">compas-scores-two-years.csv</w:t>
       </w:r>
       <w:r>
-        <w:t xml:space="preserve">, retrieved on June 11 2026 from</w:t>
+        <w:t xml:space="preserve">, retrieved on June 11, 2026 from</w:t>
       </w:r>
       <w:r>
         <w:t xml:space="preserve"> </w:t>
@@ -8188,21 +7928,7 @@
         <w:t xml:space="preserve"> </w:t>
       </w:r>
       <w:r>
-        <w:t xml:space="preserve">metrics on the filtered subset. Table </w:t>
-      </w:r>
-      <w:hyperlink w:anchor="tab:standard">
-        <w:r>
-          <w:rPr>
-            <w:rStyle w:val="Hyperlink"/>
-          </w:rPr>
-          <w:t xml:space="preserve">1</w:t>
-        </w:r>
-      </w:hyperlink>
-      <w:r>
-        <w:t xml:space="preserve"> </w:t>
-      </w:r>
-      <w:r>
-        <w:t xml:space="preserve">reports</w:t>
+        <w:t xml:space="preserve">metrics on the filtered subset. Table 1 reports</w:t>
       </w:r>
       <w:r>
         <w:t xml:space="preserve"> </w:t>
@@ -8217,7 +7943,7 @@
         <w:pStyle w:val="TableCaption"/>
       </w:pPr>
       <w:r>
-        <w:t xml:space="preserve">Standard fairness metrics on the COMPAS Black/White subset</w:t>
+        <w:t xml:space="preserve">Table 1: Standard fairness metrics on the COMPAS Black/White subset</w:t>
       </w:r>
       <w:r>
         <w:t xml:space="preserve"> </w:t>
@@ -8278,18 +8004,7 @@
         <w:t xml:space="preserve"> </w:t>
       </w:r>
       <w:r>
-        <w:t xml:space="preserve">class (see §</w:t>
-      </w:r>
-      <w:hyperlink w:anchor="sec:scorerep">
-        <w:r>
-          <w:rPr>
-            <w:rStyle w:val="Hyperlink"/>
-          </w:rPr>
-          <w:t xml:space="preserve">4.7</w:t>
-        </w:r>
-      </w:hyperlink>
-      <w:r>
-        <w:t xml:space="preserve">);</w:t>
+        <w:t xml:space="preserve">class (see §4.7);</w:t>
       </w:r>
       <w:r>
         <w:t xml:space="preserve"> </w:t>
@@ -8309,7 +8024,7 @@
         <w:tblStyle w:val="Table"/>
         <w:tblW w:type="auto" w:w="0"/>
         <w:tblLook w:firstRow="1" w:lastRow="0" w:firstColumn="0" w:lastColumn="0" w:noHBand="0" w:noVBand="0" w:val="0020"/>
-        <w:tblCaption w:val="Standard fairness metrics on the COMPAS Black/White subset (n{=}5{,}278). Binary threshold: decile \geq 5, ProPublica’s “medium-or-high” class (see §4.7); “high-risk” in the row labels follows ProPublica’s usage."/>
+        <w:tblCaption w:val="Table 1: Standard fairness metrics on the COMPAS Black/White subset (n{=}5{,}278). Binary threshold: decile \geq 5, ProPublica’s “medium-or-high” class (see §4.7); “high-risk” in the row labels follows ProPublica’s usage."/>
       </w:tblPr>
       <w:tblGrid>
         <w:gridCol w:w="1980"/>
@@ -9204,18 +8919,7 @@
         </m:r>
       </m:oMath>
       <w:r>
-        <w:t xml:space="preserve">-NN procedure of Definition </w:t>
-      </w:r>
-      <w:hyperlink w:anchor="def:lbi">
-        <w:r>
-          <w:rPr>
-            <w:rStyle w:val="Hyperlink"/>
-          </w:rPr>
-          <w:t xml:space="preserve">1</w:t>
-        </w:r>
-      </w:hyperlink>
-      <w:r>
-        <w:t xml:space="preserve">.</w:t>
+        <w:t xml:space="preserve">-NN procedure of Definition 1.</w:t>
       </w:r>
       <w:r>
         <w:t xml:space="preserve"> </w:t>
@@ -9227,18 +8931,7 @@
         <w:t xml:space="preserve"> </w:t>
       </w:r>
       <w:r>
-        <w:t xml:space="preserve">§</w:t>
-      </w:r>
-      <w:hyperlink w:anchor="sec:inference">
-        <w:r>
-          <w:rPr>
-            <w:rStyle w:val="Hyperlink"/>
-          </w:rPr>
-          <w:t xml:space="preserve">3.3</w:t>
-        </w:r>
-      </w:hyperlink>
-      <w:r>
-        <w:t xml:space="preserve">, which re-forms every neighbourhood inside each</w:t>
+        <w:t xml:space="preserve">§3.3, which re-forms every neighbourhood inside each</w:t>
       </w:r>
       <w:r>
         <w:t xml:space="preserve"> </w:t>
@@ -9361,7 +9054,7 @@
         <w:pStyle w:val="TableCaption"/>
       </w:pPr>
       <w:r>
-        <w:t xml:space="preserve">Legal Bond Index for COMPAS, by protected attribute and</w:t>
+        <w:t xml:space="preserve">Table 2: Legal Bond Index for COMPAS, by protected attribute and</w:t>
       </w:r>
       <w:r>
         <w:t xml:space="preserve"> </w:t>
@@ -9429,8 +9122,8 @@
       <w:tblPr>
         <w:tblStyle w:val="Table"/>
         <w:tblW w:type="auto" w:w="0"/>
-        <w:tblLook w:firstRow="1" w:lastRow="0" w:firstColumn="0" w:lastColumn="0" w:noHBand="0" w:noVBand="0" w:val="0020"/>
-        <w:tblCaption w:val="Legal Bond Index for COMPAS, by protected attribute and neighbourhood scale k. n = 5{,}278 defendants. CIs are pointwise percentile bootstrap with neighbourhoods re-formed in every replicate."/>
+        <w:tblLook w:firstRow="0" w:lastRow="0" w:firstColumn="0" w:lastColumn="0" w:noHBand="0" w:noVBand="0" w:val="0000"/>
+        <w:tblCaption w:val="Table 2: Legal Bond Index for COMPAS, by protected attribute and neighbourhood scale k. n = 5{,}278 defendants. CIs are pointwise percentile bootstrap with neighbourhoods re-formed in every replicate."/>
       </w:tblPr>
       <w:tblGrid>
         <w:gridCol w:w="1320"/>
@@ -9441,9 +9134,6 @@
         <w:gridCol w:w="1320"/>
       </w:tblGrid>
       <w:tr>
-        <w:trPr>
-          <w:tblHeader w:val="on"/>
-        </w:trPr>
         <w:tc>
           <w:tcPr/>
           <w:p>
@@ -9509,17 +9199,7 @@
           <w:p>
             <w:pPr>
               <w:pStyle w:val="Compact"/>
-              <w:jc w:val="right"/>
-            </w:pPr>
-            <w:r>
-              <w:t xml:space="preserve">2-3</w:t>
-            </w:r>
-            <w:r>
-              <w:t xml:space="preserve">(lr)</w:t>
-            </w:r>
-            <w:r>
-              <w:t xml:space="preserve">4-5</w:t>
-            </w:r>
+            </w:pPr>
           </w:p>
         </w:tc>
         <w:tc>
@@ -10282,21 +9962,7 @@
         <w:pStyle w:val="BodyText"/>
       </w:pPr>
       <w:r>
-        <w:t xml:space="preserve">Figure </w:t>
-      </w:r>
-      <w:hyperlink w:anchor="fig:lbi-by-attribute">
-        <w:r>
-          <w:rPr>
-            <w:rStyle w:val="Hyperlink"/>
-          </w:rPr>
-          <w:t xml:space="preserve">1</w:t>
-        </w:r>
-      </w:hyperlink>
-      <w:r>
-        <w:t xml:space="preserve"> </w:t>
-      </w:r>
-      <w:r>
-        <w:t xml:space="preserve">plots the curves. LBI(race) lies</w:t>
+        <w:t xml:space="preserve">Figure 1 plots the curves. LBI(race) lies</w:t>
       </w:r>
       <w:r>
         <w:t xml:space="preserve"> </w:t>
@@ -10362,18 +10028,7 @@
         <w:t xml:space="preserve"> </w:t>
       </w:r>
       <w:r>
-        <w:t xml:space="preserve">see §</w:t>
-      </w:r>
-      <w:hyperlink w:anchor="sec:implementation">
-        <w:r>
-          <w:rPr>
-            <w:rStyle w:val="Hyperlink"/>
-          </w:rPr>
-          <w:t xml:space="preserve">4.10</w:t>
-        </w:r>
-      </w:hyperlink>
-      <w:r>
-        <w:t xml:space="preserve">). The race curve, not any single</w:t>
+        <w:t xml:space="preserve">see §4.10). The race curve, not any single</w:t>
       </w:r>
       <w:r>
         <w:t xml:space="preserve"> </w:t>
@@ -10592,21 +10247,7 @@
         <w:t xml:space="preserve"> </w:t>
       </w:r>
       <w:r>
-        <w:t xml:space="preserve">randomization tests of §</w:t>
-      </w:r>
-      <w:hyperlink w:anchor="sec:inferenceresults">
-        <w:r>
-          <w:rPr>
-            <w:rStyle w:val="Hyperlink"/>
-          </w:rPr>
-          <w:t xml:space="preserve">4.6</w:t>
-        </w:r>
-      </w:hyperlink>
-      <w:r>
-        <w:t xml:space="preserve"> </w:t>
-      </w:r>
-      <w:r>
-        <w:t xml:space="preserve">do not reject</w:t>
+        <w:t xml:space="preserve">randomization tests of §4.6 do not reject</w:t>
       </w:r>
       <w:r>
         <w:t xml:space="preserve"> </w:t>
@@ -10688,18 +10329,7 @@
         <w:t xml:space="preserve"> </w:t>
       </w:r>
       <w:r>
-        <w:t xml:space="preserve">of sex in risk assessment (§</w:t>
-      </w:r>
-      <w:hyperlink w:anchor="sec:doctrine">
-        <w:r>
-          <w:rPr>
-            <w:rStyle w:val="Hyperlink"/>
-          </w:rPr>
-          <w:t xml:space="preserve">6.3</w:t>
-        </w:r>
-      </w:hyperlink>
-      <w:r>
-        <w:t xml:space="preserve">), so LBI(sex) is</w:t>
+        <w:t xml:space="preserve">of sex in risk assessment (§6.3), so LBI(sex) is</w:t>
       </w:r>
       <w:r>
         <w:t xml:space="preserve"> </w:t>
@@ -11018,7 +10648,7 @@
         <w:pStyle w:val="ImageCaption"/>
       </w:pPr>
       <w:r>
-        <w:t xml:space="preserve">COMPAS Legal Bond Index by protected attribute, across</w:t>
+        <w:t xml:space="preserve">Figure 1: COMPAS Legal Bond Index by protected attribute, across</w:t>
       </w:r>
       <w:r>
         <w:t xml:space="preserve"> </w:t>
@@ -11104,18 +10734,7 @@
         <w:t xml:space="preserve"> </w:t>
       </w:r>
       <w:r>
-        <w:t xml:space="preserve">(§</w:t>
-      </w:r>
-      <w:hyperlink w:anchor="sec:inferenceresults">
-        <w:r>
-          <w:rPr>
-            <w:rStyle w:val="Hyperlink"/>
-          </w:rPr>
-          <w:t xml:space="preserve">4.6</w:t>
-        </w:r>
-      </w:hyperlink>
-      <w:r>
-        <w:t xml:space="preserve">). The horizontal dashed line marks</w:t>
+        <w:t xml:space="preserve">(§4.6). The horizontal dashed line marks</w:t>
       </w:r>
       <w:r>
         <w:t xml:space="preserve"> </w:t>
@@ -11157,21 +10776,7 @@
         <w:pStyle w:val="FirstParagraph"/>
       </w:pPr>
       <w:r>
-        <w:t xml:space="preserve">Definition </w:t>
-      </w:r>
-      <w:hyperlink w:anchor="def:lbi">
-        <w:r>
-          <w:rPr>
-            <w:rStyle w:val="Hyperlink"/>
-          </w:rPr>
-          <w:t xml:space="preserve">1</w:t>
-        </w:r>
-      </w:hyperlink>
-      <w:r>
-        <w:t xml:space="preserve"> </w:t>
-      </w:r>
-      <w:r>
-        <w:t xml:space="preserve">compares each defendant with two different</w:t>
+        <w:t xml:space="preserve">Definition 1 compares each defendant with two different</w:t>
       </w:r>
       <w:r>
         <w:t xml:space="preserve"> </w:t>
@@ -11284,29 +10889,7 @@
         <w:t xml:space="preserve"> </w:t>
       </w:r>
       <w:r>
-        <w:t xml:space="preserve">(Table </w:t>
-      </w:r>
-      <w:hyperlink w:anchor="tab:distdiag">
-        <w:r>
-          <w:rPr>
-            <w:rStyle w:val="Hyperlink"/>
-          </w:rPr>
-          <w:t xml:space="preserve">3</w:t>
-        </w:r>
-      </w:hyperlink>
-      <w:r>
-        <w:t xml:space="preserve">; Figure </w:t>
-      </w:r>
-      <w:hyperlink w:anchor="fig:distdiag">
-        <w:r>
-          <w:rPr>
-            <w:rStyle w:val="Hyperlink"/>
-          </w:rPr>
-          <w:t xml:space="preserve">2</w:t>
-        </w:r>
-      </w:hyperlink>
-      <w:r>
-        <w:t xml:space="preserve">): at</w:t>
+        <w:t xml:space="preserve">(Table 3; Figure 2): at</w:t>
       </w:r>
       <w:r>
         <w:t xml:space="preserve"> </w:t>
@@ -11653,7 +11236,7 @@
         <w:pStyle w:val="TableCaption"/>
       </w:pPr>
       <w:r>
-        <w:t xml:space="preserve">Distance diagnostics: mean Mahalanobis distance from each</w:t>
+        <w:t xml:space="preserve">Table 3: Distance diagnostics: mean Mahalanobis distance from each</w:t>
       </w:r>
       <w:r>
         <w:t xml:space="preserve"> </w:t>
@@ -11681,7 +11264,7 @@
         <w:tblStyle w:val="Table"/>
         <w:tblW w:type="auto" w:w="0"/>
         <w:tblLook w:firstRow="1" w:lastRow="0" w:firstColumn="0" w:lastColumn="0" w:noHBand="0" w:noVBand="0" w:val="0020"/>
-        <w:tblCaption w:val="Distance diagnostics: mean Mahalanobis distance from each defendant to their k nearest same-race and cross-race neighbours."/>
+        <w:tblCaption w:val="Table 3: Distance diagnostics: mean Mahalanobis distance from each defendant to their k nearest same-race and cross-race neighbours."/>
       </w:tblPr>
       <w:tblGrid>
         <w:gridCol w:w="1980"/>
@@ -12099,7 +11682,7 @@
         <w:pStyle w:val="ImageCaption"/>
       </w:pPr>
       <w:r>
-        <w:t xml:space="preserve">Distribution over defendants of the mean Mahalanobis</w:t>
+        <w:t xml:space="preserve">Figure 2: Distribution over defendants of the mean Mahalanobis</w:t>
       </w:r>
       <w:r>
         <w:t xml:space="preserve"> </w:t>
@@ -12123,21 +11706,7 @@
         <w:t xml:space="preserve"> </w:t>
       </w:r>
       <w:r>
-        <w:t xml:space="preserve">specifications of §</w:t>
-      </w:r>
-      <w:hyperlink w:anchor="sec:distdiag">
-        <w:r>
-          <w:rPr>
-            <w:rStyle w:val="Hyperlink"/>
-          </w:rPr>
-          <w:t xml:space="preserve">4.5</w:t>
-        </w:r>
-      </w:hyperlink>
-      <w:r>
-        <w:t xml:space="preserve"> </w:t>
-      </w:r>
-      <w:r>
-        <w:t xml:space="preserve">quantify how much.</w:t>
+        <w:t xml:space="preserve">specifications of §4.5 quantify how much.</w:t>
       </w:r>
     </w:p>
     <w:bookmarkEnd w:id="33"/>
@@ -12239,18 +11808,7 @@
         <w:t xml:space="preserve"> </w:t>
       </w:r>
       <w:r>
-        <w:t xml:space="preserve">(Table </w:t>
-      </w:r>
-      <w:hyperlink w:anchor="tab:matchparity">
-        <w:r>
-          <w:rPr>
-            <w:rStyle w:val="Hyperlink"/>
-          </w:rPr>
-          <w:t xml:space="preserve">4</w:t>
-        </w:r>
-      </w:hyperlink>
-      <w:r>
-        <w:t xml:space="preserve">):</w:t>
+        <w:t xml:space="preserve">(Table 4):</w:t>
       </w:r>
     </w:p>
     <w:bookmarkStart w:id="34" w:name="tab:matchparity"/>
@@ -12258,6 +11816,12 @@
       <w:pPr>
         <w:pStyle w:val="TableCaption"/>
       </w:pPr>
+      <w:r>
+        <w:t xml:space="preserve">Table 4:</w:t>
+      </w:r>
+      <w:r>
+        <w:t xml:space="preserve"> </w:t>
+      </w:r>
       <m:oMath>
         <m:r>
           <m:rPr>
@@ -12350,7 +11914,7 @@
         <w:tblStyle w:val="Table"/>
         <w:tblW w:type="auto" w:w="0"/>
         <w:tblLook w:firstRow="1" w:lastRow="0" w:firstColumn="0" w:lastColumn="0" w:noHBand="0" w:noVBand="0" w:val="0020"/>
-        <w:tblCaption w:val="\mathrm{LBI}(\text{race}) at k = 20 under matching-parity specifications. CIs for restricted specifications are naive percentile bootstrap over per-defendant quantities and are reported for orientation only."/>
+        <w:tblCaption w:val="Table 4: \mathrm{LBI}(\text{race}) at k = 20 under matching-parity specifications. CIs for restricted specifications are naive percentile bootstrap over per-defendant quantities and are reported for orientation only."/>
       </w:tblPr>
       <w:tblGrid>
         <w:gridCol w:w="1980"/>
@@ -13131,18 +12695,7 @@
         <w:t xml:space="preserve"> </w:t>
       </w:r>
       <w:r>
-        <w:t xml:space="preserve">of per-defendant contrasts (Figure </w:t>
-      </w:r>
-      <w:hyperlink w:anchor="fig:gapdist">
-        <w:r>
-          <w:rPr>
-            <w:rStyle w:val="Hyperlink"/>
-          </w:rPr>
-          <w:t xml:space="preserve">3</w:t>
-        </w:r>
-      </w:hyperlink>
-      <w:r>
-        <w:t xml:space="preserve">) completes the</w:t>
+        <w:t xml:space="preserve">of per-defendant contrasts (Figure 3) completes the</w:t>
       </w:r>
       <w:r>
         <w:t xml:space="preserve"> </w:t>
@@ -13316,7 +12869,7 @@
         <w:pStyle w:val="ImageCaption"/>
       </w:pPr>
       <w:r>
-        <w:t xml:space="preserve">Distribution over defendants of the per-defendant</w:t>
+        <w:t xml:space="preserve">Figure 3: Distribution over defendants of the per-defendant</w:t>
       </w:r>
       <w:r>
         <w:t xml:space="preserve"> </w:t>
@@ -13466,32 +13019,7 @@
         <w:t xml:space="preserve"> </w:t>
       </w:r>
       <w:r>
-        <w:t xml:space="preserve">§</w:t>
-      </w:r>
-      <w:hyperlink w:anchor="sec:synthetic">
-        <w:r>
-          <w:rPr>
-            <w:rStyle w:val="Hyperlink"/>
-          </w:rPr>
-          <w:t xml:space="preserve">4.9</w:t>
-        </w:r>
-      </w:hyperlink>
-      <w:r>
-        <w:t xml:space="preserve"> </w:t>
-      </w:r>
-      <w:r>
-        <w:t xml:space="preserve">and §</w:t>
-      </w:r>
-      <w:hyperlink w:anchor="sec:inferenceresults">
-        <w:r>
-          <w:rPr>
-            <w:rStyle w:val="Hyperlink"/>
-          </w:rPr>
-          <w:t xml:space="preserve">4.6</w:t>
-        </w:r>
-      </w:hyperlink>
-      <w:r>
-        <w:t xml:space="preserve">), and a</w:t>
+        <w:t xml:space="preserve">§4.9 and §4.6), and a</w:t>
       </w:r>
       <w:r>
         <w:t xml:space="preserve"> </w:t>
@@ -13539,38 +13067,13 @@
         <w:pStyle w:val="FirstParagraph"/>
       </w:pPr>
       <w:r>
-        <w:t xml:space="preserve">Table </w:t>
-      </w:r>
-      <w:hyperlink w:anchor="tab:nulls">
-        <w:r>
-          <w:rPr>
-            <w:rStyle w:val="Hyperlink"/>
-          </w:rPr>
-          <w:t xml:space="preserve">5</w:t>
-        </w:r>
-      </w:hyperlink>
-      <w:r>
-        <w:t xml:space="preserve"> </w:t>
-      </w:r>
-      <w:r>
-        <w:t xml:space="preserve">reports the three null constructions of</w:t>
-      </w:r>
-      <w:r>
-        <w:t xml:space="preserve"> </w:t>
-      </w:r>
-      <w:r>
-        <w:t xml:space="preserve">§</w:t>
-      </w:r>
-      <w:hyperlink w:anchor="sec:inference">
-        <w:r>
-          <w:rPr>
-            <w:rStyle w:val="Hyperlink"/>
-          </w:rPr>
-          <w:t xml:space="preserve">3.3</w:t>
-        </w:r>
-      </w:hyperlink>
-      <w:r>
-        <w:t xml:space="preserve">, each with 1</w:t>
+        <w:t xml:space="preserve">Table 5 reports the three null constructions of</w:t>
+      </w:r>
+      <w:r>
+        <w:t xml:space="preserve"> </w:t>
+      </w:r>
+      <w:r>
+        <w:t xml:space="preserve">§3.3, each with 1</w:t>
       </w:r>
       <w:r>
         <w:t xml:space="preserve">,</w:t>
@@ -13641,7 +13144,7 @@
         <w:pStyle w:val="TableCaption"/>
       </w:pPr>
       <w:r>
-        <w:t xml:space="preserve">Null distributions for</w:t>
+        <w:t xml:space="preserve">Table 5: Null distributions for</w:t>
       </w:r>
       <w:r>
         <w:t xml:space="preserve"> </w:t>
@@ -13782,7 +13285,7 @@
         <w:tblStyle w:val="Table"/>
         <w:tblW w:type="auto" w:w="0"/>
         <w:tblLook w:firstRow="1" w:lastRow="0" w:firstColumn="0" w:lastColumn="0" w:noHBand="0" w:noVBand="0" w:val="0020"/>
-        <w:tblCaption w:val="Null distributions for \mathrm{LBI}(\text{race}), 1,000 draws each, full sample. z is the observed value (1.049 at k = 20) standardized against the null; the global p uses the max-z statistic across all six scales."/>
+        <w:tblCaption w:val="Table 5: Null distributions for \mathrm{LBI}(\text{race}), 1,000 draws each, full sample. z is the observed value (1.049 at k = 20) standardized against the null; the global p uses the max-z statistic across all six scales."/>
       </w:tblPr>
       <w:tblGrid>
         <w:gridCol w:w="1584"/>
@@ -14235,21 +13738,7 @@
         <w:t xml:space="preserve"> </w:t>
       </w:r>
       <w:r>
-        <w:t xml:space="preserve">§</w:t>
-      </w:r>
-      <w:hyperlink w:anchor="sec:synthetic">
-        <w:r>
-          <w:rPr>
-            <w:rStyle w:val="Hyperlink"/>
-          </w:rPr>
-          <w:t xml:space="preserve">4.9</w:t>
-        </w:r>
-      </w:hyperlink>
-      <w:r>
-        <w:t xml:space="preserve"> </w:t>
-      </w:r>
-      <w:r>
-        <w:t xml:space="preserve">shows it false-fires on more than half of</w:t>
+        <w:t xml:space="preserve">§4.9 shows it false-fires on more than half of</w:t>
       </w:r>
       <w:r>
         <w:t xml:space="preserve"> </w:t>
@@ -14344,21 +13833,7 @@
         </m:r>
       </m:oMath>
       <w:r>
-        <w:t xml:space="preserve">). Figure </w:t>
-      </w:r>
-      <w:hyperlink w:anchor="fig:permutation">
-        <w:r>
-          <w:rPr>
-            <w:rStyle w:val="Hyperlink"/>
-          </w:rPr>
-          <w:t xml:space="preserve">4</w:t>
-        </w:r>
-      </w:hyperlink>
-      <w:r>
-        <w:t xml:space="preserve"> </w:t>
-      </w:r>
-      <w:r>
-        <w:t xml:space="preserve">shows both nulls against</w:t>
+        <w:t xml:space="preserve">). Figure 4 shows both nulls against</w:t>
       </w:r>
       <w:r>
         <w:t xml:space="preserve"> </w:t>
@@ -14420,7 +13895,7 @@
         <w:pStyle w:val="ImageCaption"/>
       </w:pPr>
       <w:r>
-        <w:t xml:space="preserve">Null distributions of LBI(race) at</w:t>
+        <w:t xml:space="preserve">Figure 4: Null distributions of LBI(race) at</w:t>
       </w:r>
       <w:r>
         <w:t xml:space="preserve"> </w:t>
@@ -14725,21 +14200,7 @@
         <w:t xml:space="preserve"> </w:t>
       </w:r>
       <w:r>
-        <w:t xml:space="preserve">magnitude, Table </w:t>
-      </w:r>
-      <w:hyperlink w:anchor="tab:scorerep">
-        <w:r>
-          <w:rPr>
-            <w:rStyle w:val="Hyperlink"/>
-          </w:rPr>
-          <w:t xml:space="preserve">6</w:t>
-        </w:r>
-      </w:hyperlink>
-      <w:r>
-        <w:t xml:space="preserve"> </w:t>
-      </w:r>
-      <w:r>
-        <w:t xml:space="preserve">reports the raw numerator and</w:t>
+        <w:t xml:space="preserve">magnitude, Table 6 reports the raw numerator and</w:t>
       </w:r>
       <w:r>
         <w:t xml:space="preserve"> </w:t>
@@ -14759,6 +14220,12 @@
       <w:pPr>
         <w:pStyle w:val="TableCaption"/>
       </w:pPr>
+      <w:r>
+        <w:t xml:space="preserve">Table 6:</w:t>
+      </w:r>
+      <w:r>
+        <w:t xml:space="preserve"> </w:t>
+      </w:r>
       <m:oMath>
         <m:r>
           <m:rPr>
@@ -14851,7 +14318,7 @@
         <w:tblStyle w:val="Table"/>
         <w:tblW w:type="auto" w:w="0"/>
         <w:tblLook w:firstRow="1" w:lastRow="0" w:firstColumn="0" w:lastColumn="0" w:noHBand="0" w:noVBand="0" w:val="0020"/>
-        <w:tblCaption w:val="\mathrm{LBI}(\text{race}) at k = 20 by score representation, with the underlying matched-neighbour disagreement rates (for the decile row, mean absolute score gaps in decile units). Naive bootstrap CIs."/>
+        <w:tblCaption w:val="Table 6: \mathrm{LBI}(\text{race}) at k = 20 by score representation, with the underlying matched-neighbour disagreement rates (for the decile row, mean absolute score gaps in decile units). Naive bootstrap CIs."/>
       </w:tblPr>
       <w:tblGrid>
         <w:gridCol w:w="1584"/>
@@ -15414,21 +14881,7 @@
         <w:t xml:space="preserve"> </w:t>
       </w:r>
       <w:r>
-        <w:t xml:space="preserve">or the matching machinery itself. Table </w:t>
-      </w:r>
-      <w:hyperlink w:anchor="tab:robust">
-        <w:r>
-          <w:rPr>
-            <w:rStyle w:val="Hyperlink"/>
-          </w:rPr>
-          <w:t xml:space="preserve">7</w:t>
-        </w:r>
-      </w:hyperlink>
-      <w:r>
-        <w:t xml:space="preserve"> </w:t>
-      </w:r>
-      <w:r>
-        <w:t xml:space="preserve">tests both.</w:t>
+        <w:t xml:space="preserve">or the matching machinery itself. Table 7 tests both.</w:t>
       </w:r>
       <w:r>
         <w:t xml:space="preserve"> </w:t>
@@ -15449,7 +14902,7 @@
         <w:pStyle w:val="TableCaption"/>
       </w:pPr>
       <w:r>
-        <w:t xml:space="preserve">Robustness of</w:t>
+        <w:t xml:space="preserve">Table 7: Robustness of</w:t>
       </w:r>
       <w:r>
         <w:t xml:space="preserve"> </w:t>
@@ -15537,7 +14990,7 @@
         <w:tblStyle w:val="Table"/>
         <w:tblW w:type="auto" w:w="0"/>
         <w:tblLook w:firstRow="1" w:lastRow="0" w:firstColumn="0" w:lastColumn="0" w:noHBand="0" w:noVBand="0" w:val="0020"/>
-        <w:tblCaption w:val="Robustness of \mathrm{LBI}(\text{race}) at k = 20. Top: legitimate-feature set (Mahalanobis, decile score). Bottom: matching method (six features, decile score)."/>
+        <w:tblCaption w:val="Table 7: Robustness of \mathrm{LBI}(\text{race}) at k = 20. Top: legitimate-feature set (Mahalanobis, decile score). Bottom: matching method (six features, decile score)."/>
       </w:tblPr>
       <w:tblGrid>
         <w:gridCol w:w="2640"/>
@@ -16434,21 +15887,7 @@
         <w:t xml:space="preserve"> </w:t>
       </w:r>
       <w:r>
-        <w:t xml:space="preserve">§</w:t>
-      </w:r>
-      <w:hyperlink w:anchor="sec:distdiag">
-        <w:r>
-          <w:rPr>
-            <w:rStyle w:val="Hyperlink"/>
-          </w:rPr>
-          <w:t xml:space="preserve">4.5</w:t>
-        </w:r>
-      </w:hyperlink>
-      <w:r>
-        <w:t xml:space="preserve"> </w:t>
-      </w:r>
-      <w:r>
-        <w:t xml:space="preserve">are the specifications that move the estimate;</w:t>
+        <w:t xml:space="preserve">§4.5 are the specifications that move the estimate;</w:t>
       </w:r>
       <w:r>
         <w:t xml:space="preserve"> </w:t>
@@ -17027,7 +16466,7 @@
         <w:pStyle w:val="TableCaption"/>
       </w:pPr>
       <w:r>
-        <w:t xml:space="preserve">Semi-synthetic validation at</w:t>
+        <w:t xml:space="preserve">Table 8: Semi-synthetic validation at</w:t>
       </w:r>
       <w:r>
         <w:t xml:space="preserve"> </w:t>
@@ -17108,8 +16547,8 @@
       <w:tblPr>
         <w:tblStyle w:val="Table"/>
         <w:tblW w:type="auto" w:w="0"/>
-        <w:tblLook w:firstRow="1" w:lastRow="0" w:firstColumn="0" w:lastColumn="0" w:noHBand="0" w:noVBand="0" w:val="0020"/>
-        <w:tblCaption w:val="Semi-synthetic validation at k = 20. “Reject %” is the fraction of replicates in which each test rejects at the nominal 5 % level: under condition 1 this is the false-positive rate; under conditions 2–3, power. The Dwork-style nearest-neighbour consistency of the last column is flat across the race-structure conditions (1–3) and responds only to the omitted-predictor condition, illustrating that it measures smoothness of the score in the matching space, not protected-attribute structure."/>
+        <w:tblLook w:firstRow="0" w:lastRow="0" w:firstColumn="0" w:lastColumn="0" w:noHBand="0" w:noVBand="0" w:val="0000"/>
+        <w:tblCaption w:val="Table 8: Semi-synthetic validation at k = 20. “Reject %” is the fraction of replicates in which each test rejects at the nominal 5 % level: under condition 1 this is the false-positive rate; under conditions 2–3, power. The Dwork-style nearest-neighbour consistency of the last column is flat across the race-structure conditions (1–3) and responds only to the omitted-predictor condition, illustrating that it measures smoothness of the score in the matching space, not protected-attribute structure."/>
       </w:tblPr>
       <w:tblGrid>
         <w:gridCol w:w="1320"/>
@@ -17120,9 +16559,6 @@
         <w:gridCol w:w="1320"/>
       </w:tblGrid>
       <w:tr>
-        <w:trPr>
-          <w:tblHeader w:val="on"/>
-        </w:trPr>
         <w:tc>
           <w:tcPr/>
           <w:p>
@@ -17196,11 +16632,7 @@
           <w:p>
             <w:pPr>
               <w:pStyle w:val="Compact"/>
-              <w:jc w:val="left"/>
-            </w:pPr>
-            <w:r>
-              <w:t xml:space="preserve">3-5</w:t>
-            </w:r>
+            </w:pPr>
           </w:p>
         </w:tc>
         <w:tc>
@@ -17943,35 +17375,7 @@
         <w:pStyle w:val="BodyText"/>
       </w:pPr>
       <w:r>
-        <w:t xml:space="preserve">Table </w:t>
-      </w:r>
-      <w:hyperlink w:anchor="tab:synthetic">
-        <w:r>
-          <w:rPr>
-            <w:rStyle w:val="Hyperlink"/>
-          </w:rPr>
-          <w:t xml:space="preserve">8</w:t>
-        </w:r>
-      </w:hyperlink>
-      <w:r>
-        <w:t xml:space="preserve"> </w:t>
-      </w:r>
-      <w:r>
-        <w:t xml:space="preserve">and Figure </w:t>
-      </w:r>
-      <w:hyperlink w:anchor="fig:synthetic">
-        <w:r>
-          <w:rPr>
-            <w:rStyle w:val="Hyperlink"/>
-          </w:rPr>
-          <w:t xml:space="preserve">5</w:t>
-        </w:r>
-      </w:hyperlink>
-      <w:r>
-        <w:t xml:space="preserve"> </w:t>
-      </w:r>
-      <w:r>
-        <w:t xml:space="preserve">deliver five</w:t>
+        <w:t xml:space="preserve">Table 8 and Figure 5 deliver five</w:t>
       </w:r>
       <w:r>
         <w:t xml:space="preserve"> </w:t>
@@ -18035,21 +17439,7 @@
         <w:t xml:space="preserve"> </w:t>
       </w:r>
       <w:r>
-        <w:t xml:space="preserve">§</w:t>
-      </w:r>
-      <w:hyperlink w:anchor="sec:distdiag">
-        <w:r>
-          <w:rPr>
-            <w:rStyle w:val="Hyperlink"/>
-          </w:rPr>
-          <w:t xml:space="preserve">4.5</w:t>
-        </w:r>
-      </w:hyperlink>
-      <w:r>
-        <w:t xml:space="preserve"> </w:t>
-      </w:r>
-      <w:r>
-        <w:t xml:space="preserve">is real but small on these data.</w:t>
+        <w:t xml:space="preserve">§4.5 is real but small on these data.</w:t>
       </w:r>
     </w:p>
     <w:p>
@@ -18342,18 +17732,7 @@
         <w:t xml:space="preserve"> </w:t>
       </w:r>
       <w:r>
-        <w:t xml:space="preserve">is the irreducible limitation of §</w:t>
-      </w:r>
-      <w:hyperlink w:anchor="sec:discussion">
-        <w:r>
-          <w:rPr>
-            <w:rStyle w:val="Hyperlink"/>
-          </w:rPr>
-          <w:t xml:space="preserve">5</w:t>
-        </w:r>
-      </w:hyperlink>
-      <w:r>
-        <w:t xml:space="preserve">.</w:t>
+        <w:t xml:space="preserve">is the irreducible limitation of §5.</w:t>
       </w:r>
     </w:p>
     <w:p>
@@ -18513,7 +17892,7 @@
         <w:pStyle w:val="ImageCaption"/>
       </w:pPr>
       <w:r>
-        <w:t xml:space="preserve">Semi-synthetic validation: mean LBI at</w:t>
+        <w:t xml:space="preserve">Figure 5: Semi-synthetic validation: mean LBI at</w:t>
       </w:r>
       <w:r>
         <w:t xml:space="preserve"> </w:t>
@@ -19019,21 +18398,7 @@
         <w:pStyle w:val="FirstParagraph"/>
       </w:pPr>
       <w:r>
-        <w:t xml:space="preserve">Table </w:t>
-      </w:r>
-      <w:hyperlink w:anchor="tab:summary">
-        <w:r>
-          <w:rPr>
-            <w:rStyle w:val="Hyperlink"/>
-          </w:rPr>
-          <w:t xml:space="preserve">9</w:t>
-        </w:r>
-      </w:hyperlink>
-      <w:r>
-        <w:t xml:space="preserve"> </w:t>
-      </w:r>
-      <w:r>
-        <w:t xml:space="preserve">summarizes the empirical findings.</w:t>
+        <w:t xml:space="preserve">Table 9 summarizes the empirical findings.</w:t>
       </w:r>
     </w:p>
     <w:bookmarkStart w:id="57" w:name="tab:summary"/>
@@ -19042,7 +18407,7 @@
         <w:pStyle w:val="TableCaption"/>
       </w:pPr>
       <w:r>
-        <w:t xml:space="preserve">Headline fairness measurements on the COMPAS Black/White</w:t>
+        <w:t xml:space="preserve">Table 9: Headline fairness measurements on the COMPAS Black/White</w:t>
       </w:r>
       <w:r>
         <w:t xml:space="preserve"> </w:t>
@@ -19085,7 +18450,7 @@
         <w:tblStyle w:val="Table"/>
         <w:tblW w:type="auto" w:w="0"/>
         <w:tblLook w:firstRow="1" w:lastRow="0" w:firstColumn="0" w:lastColumn="0" w:noHBand="0" w:noVBand="0" w:val="0020"/>
-        <w:tblCaption w:val="Headline fairness measurements on the COMPAS Black/White subset, n = 5{,}278."/>
+        <w:tblCaption w:val="Table 9: Headline fairness measurements on the COMPAS Black/White subset, n = 5{,}278."/>
       </w:tblPr>
       <w:tblGrid>
         <w:gridCol w:w="2640"/>
@@ -19186,18 +18551,7 @@
               <w:t xml:space="preserve"> </w:t>
             </w:r>
             <w:r>
-              <w:t xml:space="preserve">(illustrative only; §</w:t>
-            </w:r>
-            <w:hyperlink w:anchor="sec:doctrine">
-              <w:r>
-                <w:rPr>
-                  <w:rStyle w:val="Hyperlink"/>
-                </w:rPr>
-                <w:t xml:space="preserve">6.3</w:t>
-              </w:r>
-            </w:hyperlink>
-            <w:r>
-              <w:t xml:space="preserve">)</w:t>
+              <w:t xml:space="preserve">(illustrative only; §6.3)</w:t>
             </w:r>
           </w:p>
         </w:tc>
@@ -19644,18 +18998,7 @@
               <w:jc w:val="left"/>
             </w:pPr>
             <w:r>
-              <w:t xml:space="preserve">mechanical component removed (§</w:t>
-            </w:r>
-            <w:hyperlink w:anchor="sec:distdiag">
-              <w:r>
-                <w:rPr>
-                  <w:rStyle w:val="Hyperlink"/>
-                </w:rPr>
-                <w:t xml:space="preserve">4.5</w:t>
-              </w:r>
-            </w:hyperlink>
-            <w:r>
-              <w:t xml:space="preserve">)</w:t>
+              <w:t xml:space="preserve">mechanical component removed (§4.5)</w:t>
             </w:r>
           </w:p>
         </w:tc>
@@ -20131,35 +19474,13 @@
         <w:t xml:space="preserve"> </w:t>
       </w:r>
       <w:r>
-        <w:t xml:space="preserve">group and by region of feature space (§</w:t>
-      </w:r>
-      <w:hyperlink w:anchor="sec:lbiresults">
-        <w:r>
-          <w:rPr>
-            <w:rStyle w:val="Hyperlink"/>
-          </w:rPr>
-          <w:t xml:space="preserve">4.4</w:t>
-        </w:r>
-      </w:hyperlink>
-      <w:r>
-        <w:t xml:space="preserve">,</w:t>
-      </w:r>
-      <w:r>
-        <w:t xml:space="preserve"> </w:t>
-      </w:r>
-      <w:r>
-        <w:t xml:space="preserve">§</w:t>
-      </w:r>
-      <w:hyperlink w:anchor="sec:distdiag">
-        <w:r>
-          <w:rPr>
-            <w:rStyle w:val="Hyperlink"/>
-          </w:rPr>
-          <w:t xml:space="preserve">4.5</w:t>
-        </w:r>
-      </w:hyperlink>
-      <w:r>
-        <w:t xml:space="preserve">)—so the index is best read as a screening</w:t>
+        <w:t xml:space="preserve">group and by region of feature space (§4.4,</w:t>
+      </w:r>
+      <w:r>
+        <w:t xml:space="preserve"> </w:t>
+      </w:r>
+      <w:r>
+        <w:t xml:space="preserve">§4.5)—so the index is best read as a screening</w:t>
       </w:r>
       <w:r>
         <w:t xml:space="preserve"> </w:t>
@@ -20239,10 +19560,7 @@
         <w:pStyle w:val="FirstParagraph"/>
       </w:pPr>
       <w:r>
-        <w:t xml:space="preserve"> </w:t>
-      </w:r>
-      <w:r>
-        <w:t xml:space="preserve">introduced individual fairness as the requirement</w:t>
+        <w:t xml:space="preserve">Dwork et al. (2012) introduced individual fairness as the requirement</w:t>
       </w:r>
       <w:r>
         <w:t xml:space="preserve"> </w:t>
@@ -20419,10 +19737,7 @@
         <w:pStyle w:val="FirstParagraph"/>
       </w:pPr>
       <w:r>
-        <w:t xml:space="preserve"> </w:t>
-      </w:r>
-      <w:r>
-        <w:t xml:space="preserve">require that the algorithm’s output be invariant</w:t>
+        <w:t xml:space="preserve">Kusner et al. (2017) require that the algorithm’s output be invariant</w:t>
       </w:r>
       <w:r>
         <w:t xml:space="preserve"> </w:t>
@@ -20561,18 +19876,7 @@
         <w:t xml:space="preserve"> </w:t>
       </w:r>
       <w:r>
-        <w:t xml:space="preserve">legitimate determinants (§</w:t>
-      </w:r>
-      <w:hyperlink w:anchor="sec:synthetic">
-        <w:r>
-          <w:rPr>
-            <w:rStyle w:val="Hyperlink"/>
-          </w:rPr>
-          <w:t xml:space="preserve">4.9</w:t>
-        </w:r>
-      </w:hyperlink>
-      <w:r>
-        <w:t xml:space="preserve">, condition 4), so the</w:t>
+        <w:t xml:space="preserve">legitimate determinants (§4.9, condition 4), so the</w:t>
       </w:r>
       <w:r>
         <w:t xml:space="preserve"> </w:t>
@@ -20769,18 +20073,7 @@
         <w:t xml:space="preserve"> </w:t>
       </w:r>
       <w:r>
-        <w:t xml:space="preserve">analysis (§</w:t>
-      </w:r>
-      <w:hyperlink w:anchor="sec:robustness">
-        <w:r>
-          <w:rPr>
-            <w:rStyle w:val="Hyperlink"/>
-          </w:rPr>
-          <w:t xml:space="preserve">4.8</w:t>
-        </w:r>
-      </w:hyperlink>
-      <w:r>
-        <w:t xml:space="preserve">) shows the case-level signal survives</w:t>
+        <w:t xml:space="preserve">analysis (§4.8) shows the case-level signal survives</w:t>
       </w:r>
       <w:r>
         <w:t xml:space="preserve"> </w:t>
@@ -20868,21 +20161,7 @@
         <w:t xml:space="preserve"> </w:t>
       </w:r>
       <w:r>
-        <w:t xml:space="preserve">validation suite of §</w:t>
-      </w:r>
-      <w:hyperlink w:anchor="sec:synthetic">
-        <w:r>
-          <w:rPr>
-            <w:rStyle w:val="Hyperlink"/>
-          </w:rPr>
-          <w:t xml:space="preserve">4.9</w:t>
-        </w:r>
-      </w:hyperlink>
-      <w:r>
-        <w:t xml:space="preserve"> </w:t>
-      </w:r>
-      <w:r>
-        <w:t xml:space="preserve">is built on the COMPAS</w:t>
+        <w:t xml:space="preserve">validation suite of §4.9 is built on the COMPAS</w:t>
       </w:r>
       <w:r>
         <w:t xml:space="preserve"> </w:t>
@@ -20961,21 +20240,7 @@
         <w:t xml:space="preserve"> </w:t>
       </w:r>
       <w:r>
-        <w:t xml:space="preserve">Definition </w:t>
-      </w:r>
-      <w:hyperlink w:anchor="def:lbi">
-        <w:r>
-          <w:rPr>
-            <w:rStyle w:val="Hyperlink"/>
-          </w:rPr>
-          <w:t xml:space="preserve">1</w:t>
-        </w:r>
-      </w:hyperlink>
-      <w:r>
-        <w:t xml:space="preserve"> </w:t>
-      </w:r>
-      <w:r>
-        <w:t xml:space="preserve">treats</w:t>
+        <w:t xml:space="preserve">Definition 1 treats</w:t>
       </w:r>
       <w:r>
         <w:t xml:space="preserve"> </w:t>
@@ -21101,18 +20366,7 @@
         <w:t xml:space="preserve"> </w:t>
       </w:r>
       <w:r>
-        <w:t xml:space="preserve">(§</w:t>
-      </w:r>
-      <w:hyperlink w:anchor="sec:scorerep">
-        <w:r>
-          <w:rPr>
-            <w:rStyle w:val="Hyperlink"/>
-          </w:rPr>
-          <w:t xml:space="preserve">4.7</w:t>
-        </w:r>
-      </w:hyperlink>
-      <w:r>
-        <w:t xml:space="preserve">). The legal and regulatory significance of an</w:t>
+        <w:t xml:space="preserve">(§4.7). The legal and regulatory significance of an</w:t>
       </w:r>
       <w:r>
         <w:t xml:space="preserve"> </w:t>
@@ -21124,21 +20378,7 @@
         <w:t xml:space="preserve"> </w:t>
       </w:r>
       <w:r>
-        <w:t xml:space="preserve">the matching-parity analyses of §</w:t>
-      </w:r>
-      <w:hyperlink w:anchor="sec:distdiag">
-        <w:r>
-          <w:rPr>
-            <w:rStyle w:val="Hyperlink"/>
-          </w:rPr>
-          <w:t xml:space="preserve">4.5</w:t>
-        </w:r>
-      </w:hyperlink>
-      <w:r>
-        <w:t xml:space="preserve"> </w:t>
-      </w:r>
-      <w:r>
-        <w:t xml:space="preserve">imply the</w:t>
+        <w:t xml:space="preserve">the matching-parity analyses of §4.5 imply the</w:t>
       </w:r>
       <w:r>
         <w:t xml:space="preserve"> </w:t>
@@ -21430,35 +20670,13 @@
         <w:t xml:space="preserve"> </w:t>
       </w:r>
       <w:r>
-        <w:t xml:space="preserve">(§</w:t>
-      </w:r>
-      <w:hyperlink w:anchor="sec:synthetic">
-        <w:r>
-          <w:rPr>
-            <w:rStyle w:val="Hyperlink"/>
-          </w:rPr>
-          <w:t xml:space="preserve">4.9</w:t>
-        </w:r>
-      </w:hyperlink>
-      <w:r>
-        <w:t xml:space="preserve">), which—as noted in</w:t>
-      </w:r>
-      <w:r>
-        <w:t xml:space="preserve"> </w:t>
-      </w:r>
-      <w:r>
-        <w:t xml:space="preserve">§</w:t>
-      </w:r>
-      <w:hyperlink w:anchor="sec:discussion">
-        <w:r>
-          <w:rPr>
-            <w:rStyle w:val="Hyperlink"/>
-          </w:rPr>
-          <w:t xml:space="preserve">5</w:t>
-        </w:r>
-      </w:hyperlink>
-      <w:r>
-        <w:t xml:space="preserve">—does not establish consistent performance</w:t>
+        <w:t xml:space="preserve">(§4.9), which—as noted in</w:t>
+      </w:r>
+      <w:r>
+        <w:t xml:space="preserve"> </w:t>
+      </w:r>
+      <w:r>
+        <w:t xml:space="preserve">§5—does not establish consistent performance</w:t>
       </w:r>
       <w:r>
         <w:t xml:space="preserve"> </w:t>
@@ -21620,18 +20838,7 @@
         <w:t xml:space="preserve"> </w:t>
       </w:r>
       <w:r>
-        <w:t xml:space="preserve">§</w:t>
-      </w:r>
-      <w:hyperlink w:anchor="sec:distdiag">
-        <w:r>
-          <w:rPr>
-            <w:rStyle w:val="Hyperlink"/>
-          </w:rPr>
-          <w:t xml:space="preserve">4.5</w:t>
-        </w:r>
-      </w:hyperlink>
-      <w:r>
-        <w:t xml:space="preserve">.</w:t>
+        <w:t xml:space="preserve">§4.5.</w:t>
       </w:r>
     </w:p>
     <w:p>
@@ -21858,21 +21065,7 @@
         <w:t xml:space="preserve"> </w:t>
       </w:r>
       <w:r>
-        <w:t xml:space="preserve">supported: the synthetic validation of §</w:t>
-      </w:r>
-      <w:hyperlink w:anchor="sec:synthetic">
-        <w:r>
-          <w:rPr>
-            <w:rStyle w:val="Hyperlink"/>
-          </w:rPr>
-          <w:t xml:space="preserve">4.9</w:t>
-        </w:r>
-      </w:hyperlink>
-      <w:r>
-        <w:t xml:space="preserve"> </w:t>
-      </w:r>
-      <w:r>
-        <w:t xml:space="preserve">shows</w:t>
+        <w:t xml:space="preserve">supported: the synthetic validation of §4.9 shows</w:t>
       </w:r>
       <w:r>
         <w:t xml:space="preserve"> </w:t>
@@ -22073,13 +21266,7 @@
         <w:t xml:space="preserve"> </w:t>
       </w:r>
       <w:r>
-        <w:t xml:space="preserve">constitutional claim</w:t>
-      </w:r>
-      <w:r>
-        <w:t xml:space="preserve"> </w:t>
-      </w:r>
-      <w:r>
-        <w:t xml:space="preserve">.</w:t>
+        <w:t xml:space="preserve">constitutional claim (Huq, 2019).</w:t>
       </w:r>
     </w:p>
     <w:p>
@@ -22189,13 +21376,7 @@
         <w:t xml:space="preserve"> </w:t>
       </w:r>
       <w:r>
-        <w:t xml:space="preserve">technological due-process literature</w:t>
-      </w:r>
-      <w:r>
-        <w:t xml:space="preserve"> </w:t>
-      </w:r>
-      <w:r>
-        <w:t xml:space="preserve">.</w:t>
+        <w:t xml:space="preserve">technological due-process literature (Citron, 2008).</w:t>
       </w:r>
     </w:p>
     <w:p>
@@ -22243,18 +21424,7 @@
         <w:t xml:space="preserve"> </w:t>
       </w:r>
       <w:r>
-        <w:t xml:space="preserve">setting (including, descriptively, our Table </w:t>
-      </w:r>
-      <w:hyperlink w:anchor="tab:summary">
-        <w:r>
-          <w:rPr>
-            <w:rStyle w:val="Hyperlink"/>
-          </w:rPr>
-          <w:t xml:space="preserve">9</w:t>
-        </w:r>
-      </w:hyperlink>
-      <w:r>
-        <w:t xml:space="preserve">)</w:t>
+        <w:t xml:space="preserve">setting (including, descriptively, our Table 9)</w:t>
       </w:r>
       <w:r>
         <w:t xml:space="preserve"> </w:t>
@@ -22351,25 +21521,13 @@
         <w:t xml:space="preserve"> </w:t>
       </w:r>
       <w:r>
-        <w:t xml:space="preserve">developed in</w:t>
-      </w:r>
-      <w:r>
-        <w:t xml:space="preserve"> </w:t>
-      </w:r>
-      <w:r>
-        <w:t xml:space="preserve">,</w:t>
-      </w:r>
-      <w:r>
-        <w:t xml:space="preserve"> </w:t>
-      </w:r>
-      <w:r>
-        <w:t xml:space="preserve">, and</w:t>
-      </w:r>
-      <w:r>
-        <w:t xml:space="preserve"> </w:t>
-      </w:r>
-      <w:r>
-        <w:t xml:space="preserve">; our treatment of prior and juvenile counts as</w:t>
+        <w:t xml:space="preserve">developed in Starr (2014), Mayson (2019), and</w:t>
+      </w:r>
+      <w:r>
+        <w:t xml:space="preserve"> </w:t>
+      </w:r>
+      <w:r>
+        <w:t xml:space="preserve">Huq (2019); our treatment of prior and juvenile counts as</w:t>
       </w:r>
       <w:r>
         <w:t xml:space="preserve"> </w:t>
@@ -22387,18 +21545,7 @@
         <w:t xml:space="preserve"> </w:t>
       </w:r>
       <w:r>
-        <w:t xml:space="preserve">(§</w:t>
-      </w:r>
-      <w:hyperlink w:anchor="sec:discussion">
-        <w:r>
-          <w:rPr>
-            <w:rStyle w:val="Hyperlink"/>
-          </w:rPr>
-          <w:t xml:space="preserve">5</w:t>
-        </w:r>
-      </w:hyperlink>
-      <w:r>
-        <w:t xml:space="preserve">) follows that literature.</w:t>
+        <w:t xml:space="preserve">(§5) follows that literature.</w:t>
       </w:r>
     </w:p>
     <w:p>
@@ -22947,13 +22094,7 @@
         <w:t xml:space="preserve"> </w:t>
       </w:r>
       <w:r>
-        <w:t xml:space="preserve">theoretical work</w:t>
-      </w:r>
-      <w:r>
-        <w:t xml:space="preserve"> </w:t>
-      </w:r>
-      <w:r>
-        <w:t xml:space="preserve">. The</w:t>
+        <w:t xml:space="preserve">theoretical work (Bond, 2026a; Bond, 2026b). The</w:t>
       </w:r>
       <w:r>
         <w:t xml:space="preserve"> </w:t>
@@ -23075,9 +22216,19 @@
         <w:t xml:space="preserve">No external funding supported this work.</w:t>
       </w:r>
     </w:p>
+    <w:bookmarkEnd w:id="71"/>
+    <w:bookmarkStart w:id="72" w:name="references"/>
     <w:p>
       <w:pPr>
-        <w:pStyle w:val="BodyText"/>
+        <w:pStyle w:val="Heading1"/>
+      </w:pPr>
+      <w:r>
+        <w:t xml:space="preserve">References</w:t>
+      </w:r>
+    </w:p>
+    <w:p>
+      <w:pPr>
+        <w:pStyle w:val="FirstParagraph"/>
       </w:pPr>
       <w:r>
         <w:t xml:space="preserve">99</w:t>
@@ -23630,7 +22781,7 @@
         <w:t xml:space="preserve">, 66(4), 803–872.</w:t>
       </w:r>
     </w:p>
-    <w:bookmarkEnd w:id="71"/>
+    <w:bookmarkEnd w:id="72"/>
     <w:sectPr>
       <w:footnotePr>
         <w:numRestart w:val="eachSect"/>

</xml_diff>

<commit_message>
lbi: remove thebibliography width-hint '99' leaking into docx References (editor-caught conversion artifact; entries unchanged, 16/16)
</commit_message>
<xml_diff>
--- a/docs/papers/foundations/submission/jscilaw/lbi_manuscript.docx
+++ b/docs/papers/foundations/submission/jscilaw/lbi_manuscript.docx
@@ -22229,14 +22229,6 @@
     <w:p>
       <w:pPr>
         <w:pStyle w:val="FirstParagraph"/>
-      </w:pPr>
-      <w:r>
-        <w:t xml:space="preserve">99</w:t>
-      </w:r>
-    </w:p>
-    <w:p>
-      <w:pPr>
-        <w:pStyle w:val="BodyText"/>
       </w:pPr>
       <w:r>
         <w:t xml:space="preserve">Angwin, J., Larson, J., Mattu, S., &amp; Kirchner, L. (2016).</w:t>

</xml_diff>